<commit_message>
fixed bugs in assignmments tab, added refresh page on the sidebar, archive reports sorted by creation date, improved DAR generation, will choose and generate lab template file depending on the lab the report was made, added seeds for backup and proceedures.
</commit_message>
<xml_diff>
--- a/frontend/public/CiscoLab_DAR.docx
+++ b/frontend/public/CiscoLab_DAR.docx
@@ -2228,8 +2228,6 @@
             </w:pPr>
           </w:p>
         </w:tc>
-        <w:bookmarkStart w:id="0" w:name="_GoBack"/>
-        <w:bookmarkEnd w:id="0"/>
       </w:tr>
       <w:tr>
         <w:trPr>
@@ -2242,7 +2240,6 @@
           </w:tcPr>
           <w:p>
             <w:pPr>
-              <w:jc w:val="center"/>
               <w:rPr>
                 <w:rFonts w:ascii="Cambria" w:eastAsia="Cambria" w:hAnsi="Cambria" w:cs="Cambria"/>
                 <w:bCs/>
@@ -2313,7 +2310,6 @@
           </w:tcPr>
           <w:p>
             <w:pPr>
-              <w:jc w:val="center"/>
               <w:rPr>
                 <w:rFonts w:ascii="Cambria" w:eastAsia="Cambria" w:hAnsi="Cambria" w:cs="Cambria"/>
                 <w:bCs/>
@@ -2321,6 +2317,8 @@
                 <w:szCs w:val="28"/>
               </w:rPr>
             </w:pPr>
+            <w:bookmarkStart w:id="0" w:name="_GoBack"/>
+            <w:bookmarkEnd w:id="0"/>
             <w:r>
               <w:rPr>
                 <w:rFonts w:ascii="Cambria" w:eastAsia="Cambria" w:hAnsi="Cambria" w:cs="Cambria"/>

</xml_diff>

<commit_message>
removed unecessary files and tables in database.
</commit_message>
<xml_diff>
--- a/frontend/public/CiscoLab_DAR.docx
+++ b/frontend/public/CiscoLab_DAR.docx
@@ -2317,8 +2317,6 @@
                 <w:szCs w:val="28"/>
               </w:rPr>
             </w:pPr>
-            <w:bookmarkStart w:id="0" w:name="_GoBack"/>
-            <w:bookmarkEnd w:id="0"/>
             <w:r>
               <w:rPr>
                 <w:rFonts w:ascii="Cambria" w:eastAsia="Cambria" w:hAnsi="Cambria" w:cs="Cambria"/>
@@ -2578,13 +2576,8 @@
         </w:rPr>
         <w:t>}</w:t>
       </w:r>
-      <w:r>
-        <w:rPr>
-          <w:rFonts w:ascii="Cambria" w:eastAsia="Cambria" w:hAnsi="Cambria" w:cs="Cambria"/>
-          <w:u w:val="single"/>
-        </w:rPr>
-        <w:t>_____________________________________________________________________________________________</w:t>
-      </w:r>
+      <w:bookmarkStart w:id="0" w:name="_GoBack"/>
+      <w:bookmarkEnd w:id="0"/>
     </w:p>
     <w:p>
       <w:pPr>
@@ -2877,7 +2870,6 @@
               <w:rPr>
                 <w:rFonts w:ascii="Cambria" w:eastAsia="Cambria" w:hAnsi="Cambria" w:cs="Cambria"/>
               </w:rPr>
-              <w:lastRenderedPageBreak/>
               <w:t>Laboratory Custodian</w:t>
             </w:r>
           </w:p>

</xml_diff>

<commit_message>
DAR template mapping update for cisco and lab 2
</commit_message>
<xml_diff>
--- a/frontend/public/CiscoLab_DAR.docx
+++ b/frontend/public/CiscoLab_DAR.docx
@@ -961,15 +961,15 @@
         <w:tblLook w:val="04A0" w:firstRow="1" w:lastRow="0" w:firstColumn="1" w:lastColumn="0" w:noHBand="0" w:noVBand="1"/>
       </w:tblPr>
       <w:tblGrid>
-        <w:gridCol w:w="864"/>
-        <w:gridCol w:w="864"/>
-        <w:gridCol w:w="864"/>
-        <w:gridCol w:w="864"/>
+        <w:gridCol w:w="931"/>
+        <w:gridCol w:w="931"/>
+        <w:gridCol w:w="931"/>
+        <w:gridCol w:w="931"/>
         <w:gridCol w:w="576"/>
-        <w:gridCol w:w="864"/>
-        <w:gridCol w:w="864"/>
-        <w:gridCol w:w="864"/>
-        <w:gridCol w:w="864"/>
+        <w:gridCol w:w="931"/>
+        <w:gridCol w:w="931"/>
+        <w:gridCol w:w="931"/>
+        <w:gridCol w:w="931"/>
       </w:tblGrid>
       <w:tr>
         <w:trPr>
@@ -1001,13 +1001,17 @@
           </w:p>
           <w:p>
             <w:pPr>
-              <w:rPr>
-                <w:rFonts w:ascii="Cambria" w:eastAsia="Cambria" w:hAnsi="Cambria" w:cs="Cambria"/>
-                <w:bCs/>
-                <w:sz w:val="20"/>
-                <w:szCs w:val="20"/>
-              </w:rPr>
-            </w:pPr>
+              <w:jc w:val="center"/>
+              <w:rPr>
+                <w:rFonts w:ascii="Cambria" w:eastAsia="Cambria" w:hAnsi="Cambria" w:cs="Cambria"/>
+                <w:bCs/>
+                <w:sz w:val="20"/>
+                <w:szCs w:val="20"/>
+              </w:rPr>
+            </w:pPr>
+            <w:r>
+              <w:t>{ws_1}</w:t>
+            </w:r>
           </w:p>
           <w:p>
             <w:pPr>
@@ -1043,6 +1047,23 @@
               <w:t>2</w:t>
             </w:r>
           </w:p>
+          <w:p>
+            <w:pPr>
+              <w:jc w:val="center"/>
+              <w:rPr>
+                <w:rFonts w:ascii="Cambria" w:eastAsia="Cambria" w:hAnsi="Cambria" w:cs="Cambria"/>
+                <w:bCs/>
+                <w:sz w:val="20"/>
+                <w:szCs w:val="20"/>
+              </w:rPr>
+            </w:pPr>
+            <w:r>
+              <w:t>{ws_2</w:t>
+            </w:r>
+            <w:r>
+              <w:t>}</w:t>
+            </w:r>
+          </w:p>
         </w:tc>
         <w:tc>
           <w:tcPr>
@@ -1069,13 +1090,20 @@
           </w:p>
           <w:p>
             <w:pPr>
-              <w:rPr>
-                <w:rFonts w:ascii="Cambria" w:eastAsia="Cambria" w:hAnsi="Cambria" w:cs="Cambria"/>
-                <w:bCs/>
-                <w:sz w:val="20"/>
-                <w:szCs w:val="20"/>
-              </w:rPr>
-            </w:pPr>
+              <w:jc w:val="center"/>
+              <w:rPr>
+                <w:rFonts w:ascii="Cambria" w:eastAsia="Cambria" w:hAnsi="Cambria" w:cs="Cambria"/>
+                <w:bCs/>
+                <w:sz w:val="20"/>
+                <w:szCs w:val="20"/>
+              </w:rPr>
+            </w:pPr>
+            <w:r>
+              <w:t>{ws_3</w:t>
+            </w:r>
+            <w:r>
+              <w:t>}</w:t>
+            </w:r>
           </w:p>
         </w:tc>
         <w:tc>
@@ -1103,13 +1131,20 @@
           </w:p>
           <w:p>
             <w:pPr>
-              <w:rPr>
-                <w:rFonts w:ascii="Cambria" w:eastAsia="Cambria" w:hAnsi="Cambria" w:cs="Cambria"/>
-                <w:bCs/>
-                <w:sz w:val="20"/>
-                <w:szCs w:val="20"/>
-              </w:rPr>
-            </w:pPr>
+              <w:jc w:val="center"/>
+              <w:rPr>
+                <w:rFonts w:ascii="Cambria" w:eastAsia="Cambria" w:hAnsi="Cambria" w:cs="Cambria"/>
+                <w:bCs/>
+                <w:sz w:val="20"/>
+                <w:szCs w:val="20"/>
+              </w:rPr>
+            </w:pPr>
+            <w:r>
+              <w:t>{ws_4</w:t>
+            </w:r>
+            <w:r>
+              <w:t>}</w:t>
+            </w:r>
           </w:p>
         </w:tc>
         <w:tc>
@@ -1156,13 +1191,20 @@
           </w:p>
           <w:p>
             <w:pPr>
-              <w:rPr>
-                <w:rFonts w:ascii="Cambria" w:eastAsia="Cambria" w:hAnsi="Cambria" w:cs="Cambria"/>
-                <w:bCs/>
-                <w:sz w:val="20"/>
-                <w:szCs w:val="20"/>
-              </w:rPr>
-            </w:pPr>
+              <w:jc w:val="center"/>
+              <w:rPr>
+                <w:rFonts w:ascii="Cambria" w:eastAsia="Cambria" w:hAnsi="Cambria" w:cs="Cambria"/>
+                <w:bCs/>
+                <w:sz w:val="20"/>
+                <w:szCs w:val="20"/>
+              </w:rPr>
+            </w:pPr>
+            <w:r>
+              <w:t>{ws_5</w:t>
+            </w:r>
+            <w:r>
+              <w:t>}</w:t>
+            </w:r>
           </w:p>
         </w:tc>
         <w:tc>
@@ -1190,13 +1232,20 @@
           </w:p>
           <w:p>
             <w:pPr>
-              <w:rPr>
-                <w:rFonts w:ascii="Cambria" w:eastAsia="Cambria" w:hAnsi="Cambria" w:cs="Cambria"/>
-                <w:bCs/>
-                <w:sz w:val="20"/>
-                <w:szCs w:val="20"/>
-              </w:rPr>
-            </w:pPr>
+              <w:jc w:val="center"/>
+              <w:rPr>
+                <w:rFonts w:ascii="Cambria" w:eastAsia="Cambria" w:hAnsi="Cambria" w:cs="Cambria"/>
+                <w:bCs/>
+                <w:sz w:val="20"/>
+                <w:szCs w:val="20"/>
+              </w:rPr>
+            </w:pPr>
+            <w:r>
+              <w:t>{ws_6</w:t>
+            </w:r>
+            <w:r>
+              <w:t>}</w:t>
+            </w:r>
           </w:p>
         </w:tc>
         <w:tc>
@@ -1224,13 +1273,20 @@
           </w:p>
           <w:p>
             <w:pPr>
-              <w:rPr>
-                <w:rFonts w:ascii="Cambria" w:eastAsia="Cambria" w:hAnsi="Cambria" w:cs="Cambria"/>
-                <w:bCs/>
-                <w:sz w:val="20"/>
-                <w:szCs w:val="20"/>
-              </w:rPr>
-            </w:pPr>
+              <w:jc w:val="center"/>
+              <w:rPr>
+                <w:rFonts w:ascii="Cambria" w:eastAsia="Cambria" w:hAnsi="Cambria" w:cs="Cambria"/>
+                <w:bCs/>
+                <w:sz w:val="20"/>
+                <w:szCs w:val="20"/>
+              </w:rPr>
+            </w:pPr>
+            <w:r>
+              <w:t>{ws_7</w:t>
+            </w:r>
+            <w:r>
+              <w:t>}</w:t>
+            </w:r>
           </w:p>
         </w:tc>
         <w:tc>
@@ -1258,13 +1314,20 @@
           </w:p>
           <w:p>
             <w:pPr>
-              <w:rPr>
-                <w:rFonts w:ascii="Cambria" w:eastAsia="Cambria" w:hAnsi="Cambria" w:cs="Cambria"/>
-                <w:bCs/>
-                <w:sz w:val="20"/>
-                <w:szCs w:val="20"/>
-              </w:rPr>
-            </w:pPr>
+              <w:jc w:val="center"/>
+              <w:rPr>
+                <w:rFonts w:ascii="Cambria" w:eastAsia="Cambria" w:hAnsi="Cambria" w:cs="Cambria"/>
+                <w:bCs/>
+                <w:sz w:val="20"/>
+                <w:szCs w:val="20"/>
+              </w:rPr>
+            </w:pPr>
+            <w:r>
+              <w:t>{ws_8</w:t>
+            </w:r>
+            <w:r>
+              <w:t>}</w:t>
+            </w:r>
           </w:p>
         </w:tc>
       </w:tr>
@@ -1298,13 +1361,20 @@
           </w:p>
           <w:p>
             <w:pPr>
-              <w:rPr>
-                <w:rFonts w:ascii="Cambria" w:eastAsia="Cambria" w:hAnsi="Cambria" w:cs="Cambria"/>
-                <w:bCs/>
-                <w:sz w:val="20"/>
-                <w:szCs w:val="20"/>
-              </w:rPr>
-            </w:pPr>
+              <w:jc w:val="center"/>
+              <w:rPr>
+                <w:rFonts w:ascii="Cambria" w:eastAsia="Cambria" w:hAnsi="Cambria" w:cs="Cambria"/>
+                <w:bCs/>
+                <w:sz w:val="20"/>
+                <w:szCs w:val="20"/>
+              </w:rPr>
+            </w:pPr>
+            <w:r>
+              <w:t>{ws_9</w:t>
+            </w:r>
+            <w:r>
+              <w:t>}</w:t>
+            </w:r>
           </w:p>
         </w:tc>
         <w:tc>
@@ -1332,13 +1402,23 @@
           </w:p>
           <w:p>
             <w:pPr>
-              <w:rPr>
-                <w:rFonts w:ascii="Cambria" w:eastAsia="Cambria" w:hAnsi="Cambria" w:cs="Cambria"/>
-                <w:bCs/>
-                <w:sz w:val="20"/>
-                <w:szCs w:val="20"/>
-              </w:rPr>
-            </w:pPr>
+              <w:jc w:val="center"/>
+              <w:rPr>
+                <w:rFonts w:ascii="Cambria" w:eastAsia="Cambria" w:hAnsi="Cambria" w:cs="Cambria"/>
+                <w:bCs/>
+                <w:sz w:val="20"/>
+                <w:szCs w:val="20"/>
+              </w:rPr>
+            </w:pPr>
+            <w:r>
+              <w:t>{ws_1</w:t>
+            </w:r>
+            <w:r>
+              <w:t>0</w:t>
+            </w:r>
+            <w:r>
+              <w:t>}</w:t>
+            </w:r>
           </w:p>
         </w:tc>
         <w:tc>
@@ -1366,13 +1446,23 @@
           </w:p>
           <w:p>
             <w:pPr>
-              <w:rPr>
-                <w:rFonts w:ascii="Cambria" w:eastAsia="Cambria" w:hAnsi="Cambria" w:cs="Cambria"/>
-                <w:bCs/>
-                <w:sz w:val="20"/>
-                <w:szCs w:val="20"/>
-              </w:rPr>
-            </w:pPr>
+              <w:jc w:val="center"/>
+              <w:rPr>
+                <w:rFonts w:ascii="Cambria" w:eastAsia="Cambria" w:hAnsi="Cambria" w:cs="Cambria"/>
+                <w:bCs/>
+                <w:sz w:val="20"/>
+                <w:szCs w:val="20"/>
+              </w:rPr>
+            </w:pPr>
+            <w:r>
+              <w:t>{ws_</w:t>
+            </w:r>
+            <w:r>
+              <w:t>1</w:t>
+            </w:r>
+            <w:r>
+              <w:t>1}</w:t>
+            </w:r>
           </w:p>
         </w:tc>
         <w:tc>
@@ -1400,13 +1490,23 @@
           </w:p>
           <w:p>
             <w:pPr>
-              <w:rPr>
-                <w:rFonts w:ascii="Cambria" w:eastAsia="Cambria" w:hAnsi="Cambria" w:cs="Cambria"/>
-                <w:bCs/>
-                <w:sz w:val="20"/>
-                <w:szCs w:val="20"/>
-              </w:rPr>
-            </w:pPr>
+              <w:jc w:val="center"/>
+              <w:rPr>
+                <w:rFonts w:ascii="Cambria" w:eastAsia="Cambria" w:hAnsi="Cambria" w:cs="Cambria"/>
+                <w:bCs/>
+                <w:sz w:val="20"/>
+                <w:szCs w:val="20"/>
+              </w:rPr>
+            </w:pPr>
+            <w:r>
+              <w:t>{ws_1</w:t>
+            </w:r>
+            <w:r>
+              <w:t>2</w:t>
+            </w:r>
+            <w:r>
+              <w:t>}</w:t>
+            </w:r>
           </w:p>
         </w:tc>
         <w:tc>
@@ -1453,13 +1553,23 @@
           </w:p>
           <w:p>
             <w:pPr>
-              <w:rPr>
-                <w:rFonts w:ascii="Cambria" w:eastAsia="Cambria" w:hAnsi="Cambria" w:cs="Cambria"/>
-                <w:bCs/>
-                <w:sz w:val="20"/>
-                <w:szCs w:val="20"/>
-              </w:rPr>
-            </w:pPr>
+              <w:jc w:val="center"/>
+              <w:rPr>
+                <w:rFonts w:ascii="Cambria" w:eastAsia="Cambria" w:hAnsi="Cambria" w:cs="Cambria"/>
+                <w:bCs/>
+                <w:sz w:val="20"/>
+                <w:szCs w:val="20"/>
+              </w:rPr>
+            </w:pPr>
+            <w:r>
+              <w:t>{ws_1</w:t>
+            </w:r>
+            <w:r>
+              <w:t>3</w:t>
+            </w:r>
+            <w:r>
+              <w:t>}</w:t>
+            </w:r>
           </w:p>
         </w:tc>
         <w:tc>
@@ -1487,13 +1597,23 @@
           </w:p>
           <w:p>
             <w:pPr>
-              <w:rPr>
-                <w:rFonts w:ascii="Cambria" w:eastAsia="Cambria" w:hAnsi="Cambria" w:cs="Cambria"/>
-                <w:bCs/>
-                <w:sz w:val="20"/>
-                <w:szCs w:val="20"/>
-              </w:rPr>
-            </w:pPr>
+              <w:jc w:val="center"/>
+              <w:rPr>
+                <w:rFonts w:ascii="Cambria" w:eastAsia="Cambria" w:hAnsi="Cambria" w:cs="Cambria"/>
+                <w:bCs/>
+                <w:sz w:val="20"/>
+                <w:szCs w:val="20"/>
+              </w:rPr>
+            </w:pPr>
+            <w:r>
+              <w:t>{ws_1</w:t>
+            </w:r>
+            <w:r>
+              <w:t>4</w:t>
+            </w:r>
+            <w:r>
+              <w:t>}</w:t>
+            </w:r>
           </w:p>
         </w:tc>
         <w:tc>
@@ -1521,13 +1641,23 @@
           </w:p>
           <w:p>
             <w:pPr>
-              <w:rPr>
-                <w:rFonts w:ascii="Cambria" w:eastAsia="Cambria" w:hAnsi="Cambria" w:cs="Cambria"/>
-                <w:bCs/>
-                <w:sz w:val="20"/>
-                <w:szCs w:val="20"/>
-              </w:rPr>
-            </w:pPr>
+              <w:jc w:val="center"/>
+              <w:rPr>
+                <w:rFonts w:ascii="Cambria" w:eastAsia="Cambria" w:hAnsi="Cambria" w:cs="Cambria"/>
+                <w:bCs/>
+                <w:sz w:val="20"/>
+                <w:szCs w:val="20"/>
+              </w:rPr>
+            </w:pPr>
+            <w:r>
+              <w:t>{ws_1</w:t>
+            </w:r>
+            <w:r>
+              <w:t>5</w:t>
+            </w:r>
+            <w:r>
+              <w:t>}</w:t>
+            </w:r>
           </w:p>
         </w:tc>
         <w:tc>
@@ -1555,13 +1685,23 @@
           </w:p>
           <w:p>
             <w:pPr>
-              <w:rPr>
-                <w:rFonts w:ascii="Cambria" w:eastAsia="Cambria" w:hAnsi="Cambria" w:cs="Cambria"/>
-                <w:bCs/>
-                <w:sz w:val="20"/>
-                <w:szCs w:val="20"/>
-              </w:rPr>
-            </w:pPr>
+              <w:jc w:val="center"/>
+              <w:rPr>
+                <w:rFonts w:ascii="Cambria" w:eastAsia="Cambria" w:hAnsi="Cambria" w:cs="Cambria"/>
+                <w:bCs/>
+                <w:sz w:val="20"/>
+                <w:szCs w:val="20"/>
+              </w:rPr>
+            </w:pPr>
+            <w:r>
+              <w:t>{ws_1</w:t>
+            </w:r>
+            <w:r>
+              <w:t>6</w:t>
+            </w:r>
+            <w:r>
+              <w:t>}</w:t>
+            </w:r>
           </w:p>
         </w:tc>
       </w:tr>
@@ -1595,13 +1735,23 @@
           </w:p>
           <w:p>
             <w:pPr>
-              <w:rPr>
-                <w:rFonts w:ascii="Cambria" w:eastAsia="Cambria" w:hAnsi="Cambria" w:cs="Cambria"/>
-                <w:bCs/>
-                <w:sz w:val="20"/>
-                <w:szCs w:val="20"/>
-              </w:rPr>
-            </w:pPr>
+              <w:jc w:val="center"/>
+              <w:rPr>
+                <w:rFonts w:ascii="Cambria" w:eastAsia="Cambria" w:hAnsi="Cambria" w:cs="Cambria"/>
+                <w:bCs/>
+                <w:sz w:val="20"/>
+                <w:szCs w:val="20"/>
+              </w:rPr>
+            </w:pPr>
+            <w:r>
+              <w:t>{ws_1</w:t>
+            </w:r>
+            <w:r>
+              <w:t>7</w:t>
+            </w:r>
+            <w:r>
+              <w:t>}</w:t>
+            </w:r>
           </w:p>
         </w:tc>
         <w:tc>
@@ -1629,13 +1779,23 @@
           </w:p>
           <w:p>
             <w:pPr>
-              <w:rPr>
-                <w:rFonts w:ascii="Cambria" w:eastAsia="Cambria" w:hAnsi="Cambria" w:cs="Cambria"/>
-                <w:bCs/>
-                <w:sz w:val="20"/>
-                <w:szCs w:val="20"/>
-              </w:rPr>
-            </w:pPr>
+              <w:jc w:val="center"/>
+              <w:rPr>
+                <w:rFonts w:ascii="Cambria" w:eastAsia="Cambria" w:hAnsi="Cambria" w:cs="Cambria"/>
+                <w:bCs/>
+                <w:sz w:val="20"/>
+                <w:szCs w:val="20"/>
+              </w:rPr>
+            </w:pPr>
+            <w:r>
+              <w:t>{ws_1</w:t>
+            </w:r>
+            <w:r>
+              <w:t>8</w:t>
+            </w:r>
+            <w:r>
+              <w:t>}</w:t>
+            </w:r>
           </w:p>
         </w:tc>
         <w:tc>
@@ -1663,13 +1823,23 @@
           </w:p>
           <w:p>
             <w:pPr>
-              <w:rPr>
-                <w:rFonts w:ascii="Cambria" w:eastAsia="Cambria" w:hAnsi="Cambria" w:cs="Cambria"/>
-                <w:bCs/>
-                <w:sz w:val="20"/>
-                <w:szCs w:val="20"/>
-              </w:rPr>
-            </w:pPr>
+              <w:jc w:val="center"/>
+              <w:rPr>
+                <w:rFonts w:ascii="Cambria" w:eastAsia="Cambria" w:hAnsi="Cambria" w:cs="Cambria"/>
+                <w:bCs/>
+                <w:sz w:val="20"/>
+                <w:szCs w:val="20"/>
+              </w:rPr>
+            </w:pPr>
+            <w:r>
+              <w:t>{ws_1</w:t>
+            </w:r>
+            <w:r>
+              <w:t>9</w:t>
+            </w:r>
+            <w:r>
+              <w:t>}</w:t>
+            </w:r>
           </w:p>
           <w:p>
             <w:pPr>
@@ -1707,13 +1877,20 @@
           </w:p>
           <w:p>
             <w:pPr>
-              <w:rPr>
-                <w:rFonts w:ascii="Cambria" w:eastAsia="Cambria" w:hAnsi="Cambria" w:cs="Cambria"/>
-                <w:bCs/>
-                <w:sz w:val="20"/>
-                <w:szCs w:val="20"/>
-              </w:rPr>
-            </w:pPr>
+              <w:jc w:val="center"/>
+              <w:rPr>
+                <w:rFonts w:ascii="Cambria" w:eastAsia="Cambria" w:hAnsi="Cambria" w:cs="Cambria"/>
+                <w:bCs/>
+                <w:sz w:val="20"/>
+                <w:szCs w:val="20"/>
+              </w:rPr>
+            </w:pPr>
+            <w:r>
+              <w:t>{ws_20</w:t>
+            </w:r>
+            <w:r>
+              <w:t>}</w:t>
+            </w:r>
           </w:p>
           <w:p>
             <w:pPr>
@@ -1770,13 +1947,23 @@
           </w:p>
           <w:p>
             <w:pPr>
-              <w:rPr>
-                <w:rFonts w:ascii="Cambria" w:eastAsia="Cambria" w:hAnsi="Cambria" w:cs="Cambria"/>
-                <w:bCs/>
-                <w:sz w:val="20"/>
-                <w:szCs w:val="20"/>
-              </w:rPr>
-            </w:pPr>
+              <w:jc w:val="center"/>
+              <w:rPr>
+                <w:rFonts w:ascii="Cambria" w:eastAsia="Cambria" w:hAnsi="Cambria" w:cs="Cambria"/>
+                <w:bCs/>
+                <w:sz w:val="20"/>
+                <w:szCs w:val="20"/>
+              </w:rPr>
+            </w:pPr>
+            <w:r>
+              <w:t>{ws_</w:t>
+            </w:r>
+            <w:r>
+              <w:t>2</w:t>
+            </w:r>
+            <w:r>
+              <w:t>1}</w:t>
+            </w:r>
           </w:p>
           <w:p>
             <w:pPr>
@@ -1814,13 +2001,20 @@
           </w:p>
           <w:p>
             <w:pPr>
-              <w:rPr>
-                <w:rFonts w:ascii="Cambria" w:eastAsia="Cambria" w:hAnsi="Cambria" w:cs="Cambria"/>
-                <w:bCs/>
-                <w:sz w:val="20"/>
-                <w:szCs w:val="20"/>
-              </w:rPr>
-            </w:pPr>
+              <w:jc w:val="center"/>
+              <w:rPr>
+                <w:rFonts w:ascii="Cambria" w:eastAsia="Cambria" w:hAnsi="Cambria" w:cs="Cambria"/>
+                <w:bCs/>
+                <w:sz w:val="20"/>
+                <w:szCs w:val="20"/>
+              </w:rPr>
+            </w:pPr>
+            <w:r>
+              <w:t>{ws_22</w:t>
+            </w:r>
+            <w:r>
+              <w:t>}</w:t>
+            </w:r>
           </w:p>
           <w:p>
             <w:pPr>
@@ -1858,13 +2052,23 @@
           </w:p>
           <w:p>
             <w:pPr>
-              <w:rPr>
-                <w:rFonts w:ascii="Cambria" w:eastAsia="Cambria" w:hAnsi="Cambria" w:cs="Cambria"/>
-                <w:bCs/>
-                <w:sz w:val="20"/>
-                <w:szCs w:val="20"/>
-              </w:rPr>
-            </w:pPr>
+              <w:jc w:val="center"/>
+              <w:rPr>
+                <w:rFonts w:ascii="Cambria" w:eastAsia="Cambria" w:hAnsi="Cambria" w:cs="Cambria"/>
+                <w:bCs/>
+                <w:sz w:val="20"/>
+                <w:szCs w:val="20"/>
+              </w:rPr>
+            </w:pPr>
+            <w:r>
+              <w:t>{ws_</w:t>
+            </w:r>
+            <w:r>
+              <w:t>23</w:t>
+            </w:r>
+            <w:r>
+              <w:t>}</w:t>
+            </w:r>
           </w:p>
           <w:p>
             <w:pPr>
@@ -1902,13 +2106,23 @@
           </w:p>
           <w:p>
             <w:pPr>
-              <w:rPr>
-                <w:rFonts w:ascii="Cambria" w:eastAsia="Cambria" w:hAnsi="Cambria" w:cs="Cambria"/>
-                <w:bCs/>
-                <w:sz w:val="20"/>
-                <w:szCs w:val="20"/>
-              </w:rPr>
-            </w:pPr>
+              <w:jc w:val="center"/>
+              <w:rPr>
+                <w:rFonts w:ascii="Cambria" w:eastAsia="Cambria" w:hAnsi="Cambria" w:cs="Cambria"/>
+                <w:bCs/>
+                <w:sz w:val="20"/>
+                <w:szCs w:val="20"/>
+              </w:rPr>
+            </w:pPr>
+            <w:r>
+              <w:t>{ws_</w:t>
+            </w:r>
+            <w:r>
+              <w:t>24</w:t>
+            </w:r>
+            <w:r>
+              <w:t>}</w:t>
+            </w:r>
           </w:p>
           <w:p>
             <w:pPr>
@@ -1952,13 +2166,23 @@
           </w:p>
           <w:p>
             <w:pPr>
-              <w:rPr>
-                <w:rFonts w:ascii="Cambria" w:eastAsia="Cambria" w:hAnsi="Cambria" w:cs="Cambria"/>
-                <w:bCs/>
-                <w:sz w:val="20"/>
-                <w:szCs w:val="20"/>
-              </w:rPr>
-            </w:pPr>
+              <w:jc w:val="center"/>
+              <w:rPr>
+                <w:rFonts w:ascii="Cambria" w:eastAsia="Cambria" w:hAnsi="Cambria" w:cs="Cambria"/>
+                <w:bCs/>
+                <w:sz w:val="20"/>
+                <w:szCs w:val="20"/>
+              </w:rPr>
+            </w:pPr>
+            <w:r>
+              <w:t>{ws_</w:t>
+            </w:r>
+            <w:r>
+              <w:t>25</w:t>
+            </w:r>
+            <w:r>
+              <w:t>}</w:t>
+            </w:r>
           </w:p>
           <w:p>
             <w:pPr>
@@ -1996,13 +2220,23 @@
           </w:p>
           <w:p>
             <w:pPr>
-              <w:rPr>
-                <w:rFonts w:ascii="Cambria" w:eastAsia="Cambria" w:hAnsi="Cambria" w:cs="Cambria"/>
-                <w:bCs/>
-                <w:sz w:val="20"/>
-                <w:szCs w:val="20"/>
-              </w:rPr>
-            </w:pPr>
+              <w:jc w:val="center"/>
+              <w:rPr>
+                <w:rFonts w:ascii="Cambria" w:eastAsia="Cambria" w:hAnsi="Cambria" w:cs="Cambria"/>
+                <w:bCs/>
+                <w:sz w:val="20"/>
+                <w:szCs w:val="20"/>
+              </w:rPr>
+            </w:pPr>
+            <w:r>
+              <w:t>{ws_</w:t>
+            </w:r>
+            <w:r>
+              <w:t>26</w:t>
+            </w:r>
+            <w:r>
+              <w:t>}</w:t>
+            </w:r>
           </w:p>
         </w:tc>
         <w:tc>
@@ -2030,13 +2264,23 @@
           </w:p>
           <w:p>
             <w:pPr>
-              <w:rPr>
-                <w:rFonts w:ascii="Cambria" w:eastAsia="Cambria" w:hAnsi="Cambria" w:cs="Cambria"/>
-                <w:bCs/>
-                <w:sz w:val="20"/>
-                <w:szCs w:val="20"/>
-              </w:rPr>
-            </w:pPr>
+              <w:jc w:val="center"/>
+              <w:rPr>
+                <w:rFonts w:ascii="Cambria" w:eastAsia="Cambria" w:hAnsi="Cambria" w:cs="Cambria"/>
+                <w:bCs/>
+                <w:sz w:val="20"/>
+                <w:szCs w:val="20"/>
+              </w:rPr>
+            </w:pPr>
+            <w:r>
+              <w:t>{ws_</w:t>
+            </w:r>
+            <w:r>
+              <w:t>27</w:t>
+            </w:r>
+            <w:r>
+              <w:t>}</w:t>
+            </w:r>
           </w:p>
         </w:tc>
         <w:tc>
@@ -2064,13 +2308,23 @@
           </w:p>
           <w:p>
             <w:pPr>
-              <w:rPr>
-                <w:rFonts w:ascii="Cambria" w:eastAsia="Cambria" w:hAnsi="Cambria" w:cs="Cambria"/>
-                <w:bCs/>
-                <w:sz w:val="20"/>
-                <w:szCs w:val="20"/>
-              </w:rPr>
-            </w:pPr>
+              <w:jc w:val="center"/>
+              <w:rPr>
+                <w:rFonts w:ascii="Cambria" w:eastAsia="Cambria" w:hAnsi="Cambria" w:cs="Cambria"/>
+                <w:bCs/>
+                <w:sz w:val="20"/>
+                <w:szCs w:val="20"/>
+              </w:rPr>
+            </w:pPr>
+            <w:r>
+              <w:t>{ws_</w:t>
+            </w:r>
+            <w:r>
+              <w:t>28</w:t>
+            </w:r>
+            <w:r>
+              <w:t>}</w:t>
+            </w:r>
           </w:p>
         </w:tc>
         <w:tc>
@@ -2117,13 +2371,23 @@
           </w:p>
           <w:p>
             <w:pPr>
-              <w:rPr>
-                <w:rFonts w:ascii="Cambria" w:eastAsia="Cambria" w:hAnsi="Cambria" w:cs="Cambria"/>
-                <w:bCs/>
-                <w:sz w:val="20"/>
-                <w:szCs w:val="20"/>
-              </w:rPr>
-            </w:pPr>
+              <w:jc w:val="center"/>
+              <w:rPr>
+                <w:rFonts w:ascii="Cambria" w:eastAsia="Cambria" w:hAnsi="Cambria" w:cs="Cambria"/>
+                <w:bCs/>
+                <w:sz w:val="20"/>
+                <w:szCs w:val="20"/>
+              </w:rPr>
+            </w:pPr>
+            <w:r>
+              <w:t>{ws_</w:t>
+            </w:r>
+            <w:r>
+              <w:t>29</w:t>
+            </w:r>
+            <w:r>
+              <w:t>}</w:t>
+            </w:r>
           </w:p>
         </w:tc>
         <w:tc>
@@ -2151,13 +2415,23 @@
           </w:p>
           <w:p>
             <w:pPr>
-              <w:rPr>
-                <w:rFonts w:ascii="Cambria" w:eastAsia="Cambria" w:hAnsi="Cambria" w:cs="Cambria"/>
-                <w:bCs/>
-                <w:sz w:val="20"/>
-                <w:szCs w:val="20"/>
-              </w:rPr>
-            </w:pPr>
+              <w:jc w:val="center"/>
+              <w:rPr>
+                <w:rFonts w:ascii="Cambria" w:eastAsia="Cambria" w:hAnsi="Cambria" w:cs="Cambria"/>
+                <w:bCs/>
+                <w:sz w:val="20"/>
+                <w:szCs w:val="20"/>
+              </w:rPr>
+            </w:pPr>
+            <w:r>
+              <w:t>{ws_</w:t>
+            </w:r>
+            <w:r>
+              <w:t>30</w:t>
+            </w:r>
+            <w:r>
+              <w:t>}</w:t>
+            </w:r>
           </w:p>
         </w:tc>
         <w:tc>
@@ -2185,13 +2459,23 @@
           </w:p>
           <w:p>
             <w:pPr>
-              <w:rPr>
-                <w:rFonts w:ascii="Cambria" w:eastAsia="Cambria" w:hAnsi="Cambria" w:cs="Cambria"/>
-                <w:bCs/>
-                <w:sz w:val="20"/>
-                <w:szCs w:val="20"/>
-              </w:rPr>
-            </w:pPr>
+              <w:jc w:val="center"/>
+              <w:rPr>
+                <w:rFonts w:ascii="Cambria" w:eastAsia="Cambria" w:hAnsi="Cambria" w:cs="Cambria"/>
+                <w:bCs/>
+                <w:sz w:val="20"/>
+                <w:szCs w:val="20"/>
+              </w:rPr>
+            </w:pPr>
+            <w:r>
+              <w:t>{ws_</w:t>
+            </w:r>
+            <w:r>
+              <w:t>3</w:t>
+            </w:r>
+            <w:r>
+              <w:t>1}</w:t>
+            </w:r>
           </w:p>
         </w:tc>
         <w:tc>
@@ -2219,15 +2503,24 @@
           </w:p>
           <w:p>
             <w:pPr>
-              <w:rPr>
-                <w:rFonts w:ascii="Cambria" w:eastAsia="Cambria" w:hAnsi="Cambria" w:cs="Cambria"/>
-                <w:bCs/>
-                <w:sz w:val="20"/>
-                <w:szCs w:val="20"/>
-              </w:rPr>
-            </w:pPr>
-          </w:p>
-        </w:tc>
+              <w:jc w:val="center"/>
+              <w:rPr>
+                <w:rFonts w:ascii="Cambria" w:eastAsia="Cambria" w:hAnsi="Cambria" w:cs="Cambria"/>
+                <w:bCs/>
+                <w:sz w:val="20"/>
+                <w:szCs w:val="20"/>
+              </w:rPr>
+            </w:pPr>
+            <w:r>
+              <w:t>{ws_32</w:t>
+            </w:r>
+            <w:r>
+              <w:t>}</w:t>
+            </w:r>
+          </w:p>
+        </w:tc>
+        <w:bookmarkStart w:id="0" w:name="_GoBack"/>
+        <w:bookmarkEnd w:id="0"/>
       </w:tr>
       <w:tr>
         <w:trPr>
@@ -2267,6 +2560,12 @@
                 <w:szCs w:val="20"/>
               </w:rPr>
             </w:pPr>
+            <w:r>
+              <w:t>{ws_33</w:t>
+            </w:r>
+            <w:r>
+              <w:t>}</w:t>
+            </w:r>
           </w:p>
         </w:tc>
         <w:tc>
@@ -2302,6 +2601,12 @@
                 <w:szCs w:val="20"/>
               </w:rPr>
             </w:pPr>
+            <w:r>
+              <w:t>{ws_34</w:t>
+            </w:r>
+            <w:r>
+              <w:t>}</w:t>
+            </w:r>
           </w:p>
         </w:tc>
         <w:tc>
@@ -2337,6 +2642,12 @@
                 <w:szCs w:val="20"/>
               </w:rPr>
             </w:pPr>
+            <w:r>
+              <w:t>{ws_35</w:t>
+            </w:r>
+            <w:r>
+              <w:t>}</w:t>
+            </w:r>
           </w:p>
         </w:tc>
         <w:tc>
@@ -2364,13 +2675,20 @@
           </w:p>
           <w:p>
             <w:pPr>
-              <w:rPr>
-                <w:rFonts w:ascii="Cambria" w:eastAsia="Cambria" w:hAnsi="Cambria" w:cs="Cambria"/>
-                <w:bCs/>
-                <w:sz w:val="20"/>
-                <w:szCs w:val="20"/>
-              </w:rPr>
-            </w:pPr>
+              <w:jc w:val="center"/>
+              <w:rPr>
+                <w:rFonts w:ascii="Cambria" w:eastAsia="Cambria" w:hAnsi="Cambria" w:cs="Cambria"/>
+                <w:bCs/>
+                <w:sz w:val="20"/>
+                <w:szCs w:val="20"/>
+              </w:rPr>
+            </w:pPr>
+            <w:r>
+              <w:t>{ws_36</w:t>
+            </w:r>
+            <w:r>
+              <w:t>}</w:t>
+            </w:r>
           </w:p>
         </w:tc>
         <w:tc>
@@ -2417,13 +2735,20 @@
           </w:p>
           <w:p>
             <w:pPr>
-              <w:rPr>
-                <w:rFonts w:ascii="Cambria" w:eastAsia="Cambria" w:hAnsi="Cambria" w:cs="Cambria"/>
-                <w:bCs/>
-                <w:sz w:val="20"/>
-                <w:szCs w:val="20"/>
-              </w:rPr>
-            </w:pPr>
+              <w:jc w:val="center"/>
+              <w:rPr>
+                <w:rFonts w:ascii="Cambria" w:eastAsia="Cambria" w:hAnsi="Cambria" w:cs="Cambria"/>
+                <w:bCs/>
+                <w:sz w:val="20"/>
+                <w:szCs w:val="20"/>
+              </w:rPr>
+            </w:pPr>
+            <w:r>
+              <w:t>{ws_37</w:t>
+            </w:r>
+            <w:r>
+              <w:t>}</w:t>
+            </w:r>
           </w:p>
         </w:tc>
         <w:tc>
@@ -2451,13 +2776,20 @@
           </w:p>
           <w:p>
             <w:pPr>
-              <w:rPr>
-                <w:rFonts w:ascii="Cambria" w:eastAsia="Cambria" w:hAnsi="Cambria" w:cs="Cambria"/>
-                <w:bCs/>
-                <w:sz w:val="20"/>
-                <w:szCs w:val="20"/>
-              </w:rPr>
-            </w:pPr>
+              <w:jc w:val="center"/>
+              <w:rPr>
+                <w:rFonts w:ascii="Cambria" w:eastAsia="Cambria" w:hAnsi="Cambria" w:cs="Cambria"/>
+                <w:bCs/>
+                <w:sz w:val="20"/>
+                <w:szCs w:val="20"/>
+              </w:rPr>
+            </w:pPr>
+            <w:r>
+              <w:t>{ws_38</w:t>
+            </w:r>
+            <w:r>
+              <w:t>}</w:t>
+            </w:r>
           </w:p>
         </w:tc>
         <w:tc>
@@ -2485,13 +2817,20 @@
           </w:p>
           <w:p>
             <w:pPr>
-              <w:rPr>
-                <w:rFonts w:ascii="Cambria" w:eastAsia="Cambria" w:hAnsi="Cambria" w:cs="Cambria"/>
-                <w:bCs/>
-                <w:sz w:val="20"/>
-                <w:szCs w:val="20"/>
-              </w:rPr>
-            </w:pPr>
+              <w:jc w:val="center"/>
+              <w:rPr>
+                <w:rFonts w:ascii="Cambria" w:eastAsia="Cambria" w:hAnsi="Cambria" w:cs="Cambria"/>
+                <w:bCs/>
+                <w:sz w:val="20"/>
+                <w:szCs w:val="20"/>
+              </w:rPr>
+            </w:pPr>
+            <w:r>
+              <w:t>{ws_39</w:t>
+            </w:r>
+            <w:r>
+              <w:t>}</w:t>
+            </w:r>
           </w:p>
         </w:tc>
         <w:tc>
@@ -2519,13 +2858,20 @@
           </w:p>
           <w:p>
             <w:pPr>
-              <w:rPr>
-                <w:rFonts w:ascii="Cambria" w:eastAsia="Cambria" w:hAnsi="Cambria" w:cs="Cambria"/>
-                <w:bCs/>
-                <w:sz w:val="20"/>
-                <w:szCs w:val="20"/>
-              </w:rPr>
-            </w:pPr>
+              <w:jc w:val="center"/>
+              <w:rPr>
+                <w:rFonts w:ascii="Cambria" w:eastAsia="Cambria" w:hAnsi="Cambria" w:cs="Cambria"/>
+                <w:bCs/>
+                <w:sz w:val="20"/>
+                <w:szCs w:val="20"/>
+              </w:rPr>
+            </w:pPr>
+            <w:r>
+              <w:t>{ws_40</w:t>
+            </w:r>
+            <w:r>
+              <w:t>}</w:t>
+            </w:r>
           </w:p>
         </w:tc>
       </w:tr>
@@ -2576,8 +2922,6 @@
         </w:rPr>
         <w:t>}</w:t>
       </w:r>
-      <w:bookmarkStart w:id="0" w:name="_GoBack"/>
-      <w:bookmarkEnd w:id="0"/>
     </w:p>
     <w:p>
       <w:pPr>
@@ -2870,6 +3214,7 @@
               <w:rPr>
                 <w:rFonts w:ascii="Cambria" w:eastAsia="Cambria" w:hAnsi="Cambria" w:cs="Cambria"/>
               </w:rPr>
+              <w:lastRenderedPageBreak/>
               <w:t>Laboratory Custodian</w:t>
             </w:r>
           </w:p>
@@ -3590,7 +3935,6 @@
       <w:rPr>
         <w:noProof/>
         <w:color w:val="000000"/>
-        <w:lang w:val="en-PH" w:eastAsia="en-PH"/>
       </w:rPr>
       <w:drawing>
         <wp:inline distT="0" distB="0" distL="0" distR="0" wp14:anchorId="2BA53806" wp14:editId="7C62F8B2">

</xml_diff>

<commit_message>
backend refactored clean version
</commit_message>
<xml_diff>
--- a/frontend/public/CiscoLab_DAR.docx
+++ b/frontend/public/CiscoLab_DAR.docx
@@ -961,15 +961,15 @@
         <w:tblLook w:val="04A0" w:firstRow="1" w:lastRow="0" w:firstColumn="1" w:lastColumn="0" w:noHBand="0" w:noVBand="1"/>
       </w:tblPr>
       <w:tblGrid>
-        <w:gridCol w:w="864"/>
-        <w:gridCol w:w="864"/>
-        <w:gridCol w:w="864"/>
-        <w:gridCol w:w="864"/>
+        <w:gridCol w:w="931"/>
+        <w:gridCol w:w="931"/>
+        <w:gridCol w:w="931"/>
+        <w:gridCol w:w="931"/>
         <w:gridCol w:w="576"/>
-        <w:gridCol w:w="864"/>
-        <w:gridCol w:w="864"/>
-        <w:gridCol w:w="864"/>
-        <w:gridCol w:w="864"/>
+        <w:gridCol w:w="931"/>
+        <w:gridCol w:w="931"/>
+        <w:gridCol w:w="931"/>
+        <w:gridCol w:w="931"/>
       </w:tblGrid>
       <w:tr>
         <w:trPr>
@@ -1001,13 +1001,17 @@
           </w:p>
           <w:p>
             <w:pPr>
-              <w:rPr>
-                <w:rFonts w:ascii="Cambria" w:eastAsia="Cambria" w:hAnsi="Cambria" w:cs="Cambria"/>
-                <w:bCs/>
-                <w:sz w:val="20"/>
-                <w:szCs w:val="20"/>
-              </w:rPr>
-            </w:pPr>
+              <w:jc w:val="center"/>
+              <w:rPr>
+                <w:rFonts w:ascii="Cambria" w:eastAsia="Cambria" w:hAnsi="Cambria" w:cs="Cambria"/>
+                <w:bCs/>
+                <w:sz w:val="20"/>
+                <w:szCs w:val="20"/>
+              </w:rPr>
+            </w:pPr>
+            <w:r>
+              <w:t>{ws_1}</w:t>
+            </w:r>
           </w:p>
           <w:p>
             <w:pPr>
@@ -1043,6 +1047,23 @@
               <w:t>2</w:t>
             </w:r>
           </w:p>
+          <w:p>
+            <w:pPr>
+              <w:jc w:val="center"/>
+              <w:rPr>
+                <w:rFonts w:ascii="Cambria" w:eastAsia="Cambria" w:hAnsi="Cambria" w:cs="Cambria"/>
+                <w:bCs/>
+                <w:sz w:val="20"/>
+                <w:szCs w:val="20"/>
+              </w:rPr>
+            </w:pPr>
+            <w:r>
+              <w:t>{ws_2</w:t>
+            </w:r>
+            <w:r>
+              <w:t>}</w:t>
+            </w:r>
+          </w:p>
         </w:tc>
         <w:tc>
           <w:tcPr>
@@ -1069,13 +1090,20 @@
           </w:p>
           <w:p>
             <w:pPr>
-              <w:rPr>
-                <w:rFonts w:ascii="Cambria" w:eastAsia="Cambria" w:hAnsi="Cambria" w:cs="Cambria"/>
-                <w:bCs/>
-                <w:sz w:val="20"/>
-                <w:szCs w:val="20"/>
-              </w:rPr>
-            </w:pPr>
+              <w:jc w:val="center"/>
+              <w:rPr>
+                <w:rFonts w:ascii="Cambria" w:eastAsia="Cambria" w:hAnsi="Cambria" w:cs="Cambria"/>
+                <w:bCs/>
+                <w:sz w:val="20"/>
+                <w:szCs w:val="20"/>
+              </w:rPr>
+            </w:pPr>
+            <w:r>
+              <w:t>{ws_3</w:t>
+            </w:r>
+            <w:r>
+              <w:t>}</w:t>
+            </w:r>
           </w:p>
         </w:tc>
         <w:tc>
@@ -1103,13 +1131,20 @@
           </w:p>
           <w:p>
             <w:pPr>
-              <w:rPr>
-                <w:rFonts w:ascii="Cambria" w:eastAsia="Cambria" w:hAnsi="Cambria" w:cs="Cambria"/>
-                <w:bCs/>
-                <w:sz w:val="20"/>
-                <w:szCs w:val="20"/>
-              </w:rPr>
-            </w:pPr>
+              <w:jc w:val="center"/>
+              <w:rPr>
+                <w:rFonts w:ascii="Cambria" w:eastAsia="Cambria" w:hAnsi="Cambria" w:cs="Cambria"/>
+                <w:bCs/>
+                <w:sz w:val="20"/>
+                <w:szCs w:val="20"/>
+              </w:rPr>
+            </w:pPr>
+            <w:r>
+              <w:t>{ws_4</w:t>
+            </w:r>
+            <w:r>
+              <w:t>}</w:t>
+            </w:r>
           </w:p>
         </w:tc>
         <w:tc>
@@ -1156,13 +1191,20 @@
           </w:p>
           <w:p>
             <w:pPr>
-              <w:rPr>
-                <w:rFonts w:ascii="Cambria" w:eastAsia="Cambria" w:hAnsi="Cambria" w:cs="Cambria"/>
-                <w:bCs/>
-                <w:sz w:val="20"/>
-                <w:szCs w:val="20"/>
-              </w:rPr>
-            </w:pPr>
+              <w:jc w:val="center"/>
+              <w:rPr>
+                <w:rFonts w:ascii="Cambria" w:eastAsia="Cambria" w:hAnsi="Cambria" w:cs="Cambria"/>
+                <w:bCs/>
+                <w:sz w:val="20"/>
+                <w:szCs w:val="20"/>
+              </w:rPr>
+            </w:pPr>
+            <w:r>
+              <w:t>{ws_5</w:t>
+            </w:r>
+            <w:r>
+              <w:t>}</w:t>
+            </w:r>
           </w:p>
         </w:tc>
         <w:tc>
@@ -1190,13 +1232,20 @@
           </w:p>
           <w:p>
             <w:pPr>
-              <w:rPr>
-                <w:rFonts w:ascii="Cambria" w:eastAsia="Cambria" w:hAnsi="Cambria" w:cs="Cambria"/>
-                <w:bCs/>
-                <w:sz w:val="20"/>
-                <w:szCs w:val="20"/>
-              </w:rPr>
-            </w:pPr>
+              <w:jc w:val="center"/>
+              <w:rPr>
+                <w:rFonts w:ascii="Cambria" w:eastAsia="Cambria" w:hAnsi="Cambria" w:cs="Cambria"/>
+                <w:bCs/>
+                <w:sz w:val="20"/>
+                <w:szCs w:val="20"/>
+              </w:rPr>
+            </w:pPr>
+            <w:r>
+              <w:t>{ws_6</w:t>
+            </w:r>
+            <w:r>
+              <w:t>}</w:t>
+            </w:r>
           </w:p>
         </w:tc>
         <w:tc>
@@ -1224,13 +1273,20 @@
           </w:p>
           <w:p>
             <w:pPr>
-              <w:rPr>
-                <w:rFonts w:ascii="Cambria" w:eastAsia="Cambria" w:hAnsi="Cambria" w:cs="Cambria"/>
-                <w:bCs/>
-                <w:sz w:val="20"/>
-                <w:szCs w:val="20"/>
-              </w:rPr>
-            </w:pPr>
+              <w:jc w:val="center"/>
+              <w:rPr>
+                <w:rFonts w:ascii="Cambria" w:eastAsia="Cambria" w:hAnsi="Cambria" w:cs="Cambria"/>
+                <w:bCs/>
+                <w:sz w:val="20"/>
+                <w:szCs w:val="20"/>
+              </w:rPr>
+            </w:pPr>
+            <w:r>
+              <w:t>{ws_7</w:t>
+            </w:r>
+            <w:r>
+              <w:t>}</w:t>
+            </w:r>
           </w:p>
         </w:tc>
         <w:tc>
@@ -1258,13 +1314,20 @@
           </w:p>
           <w:p>
             <w:pPr>
-              <w:rPr>
-                <w:rFonts w:ascii="Cambria" w:eastAsia="Cambria" w:hAnsi="Cambria" w:cs="Cambria"/>
-                <w:bCs/>
-                <w:sz w:val="20"/>
-                <w:szCs w:val="20"/>
-              </w:rPr>
-            </w:pPr>
+              <w:jc w:val="center"/>
+              <w:rPr>
+                <w:rFonts w:ascii="Cambria" w:eastAsia="Cambria" w:hAnsi="Cambria" w:cs="Cambria"/>
+                <w:bCs/>
+                <w:sz w:val="20"/>
+                <w:szCs w:val="20"/>
+              </w:rPr>
+            </w:pPr>
+            <w:r>
+              <w:t>{ws_8</w:t>
+            </w:r>
+            <w:r>
+              <w:t>}</w:t>
+            </w:r>
           </w:p>
         </w:tc>
       </w:tr>
@@ -1298,13 +1361,20 @@
           </w:p>
           <w:p>
             <w:pPr>
-              <w:rPr>
-                <w:rFonts w:ascii="Cambria" w:eastAsia="Cambria" w:hAnsi="Cambria" w:cs="Cambria"/>
-                <w:bCs/>
-                <w:sz w:val="20"/>
-                <w:szCs w:val="20"/>
-              </w:rPr>
-            </w:pPr>
+              <w:jc w:val="center"/>
+              <w:rPr>
+                <w:rFonts w:ascii="Cambria" w:eastAsia="Cambria" w:hAnsi="Cambria" w:cs="Cambria"/>
+                <w:bCs/>
+                <w:sz w:val="20"/>
+                <w:szCs w:val="20"/>
+              </w:rPr>
+            </w:pPr>
+            <w:r>
+              <w:t>{ws_9</w:t>
+            </w:r>
+            <w:r>
+              <w:t>}</w:t>
+            </w:r>
           </w:p>
         </w:tc>
         <w:tc>
@@ -1332,13 +1402,23 @@
           </w:p>
           <w:p>
             <w:pPr>
-              <w:rPr>
-                <w:rFonts w:ascii="Cambria" w:eastAsia="Cambria" w:hAnsi="Cambria" w:cs="Cambria"/>
-                <w:bCs/>
-                <w:sz w:val="20"/>
-                <w:szCs w:val="20"/>
-              </w:rPr>
-            </w:pPr>
+              <w:jc w:val="center"/>
+              <w:rPr>
+                <w:rFonts w:ascii="Cambria" w:eastAsia="Cambria" w:hAnsi="Cambria" w:cs="Cambria"/>
+                <w:bCs/>
+                <w:sz w:val="20"/>
+                <w:szCs w:val="20"/>
+              </w:rPr>
+            </w:pPr>
+            <w:r>
+              <w:t>{ws_1</w:t>
+            </w:r>
+            <w:r>
+              <w:t>0</w:t>
+            </w:r>
+            <w:r>
+              <w:t>}</w:t>
+            </w:r>
           </w:p>
         </w:tc>
         <w:tc>
@@ -1366,13 +1446,23 @@
           </w:p>
           <w:p>
             <w:pPr>
-              <w:rPr>
-                <w:rFonts w:ascii="Cambria" w:eastAsia="Cambria" w:hAnsi="Cambria" w:cs="Cambria"/>
-                <w:bCs/>
-                <w:sz w:val="20"/>
-                <w:szCs w:val="20"/>
-              </w:rPr>
-            </w:pPr>
+              <w:jc w:val="center"/>
+              <w:rPr>
+                <w:rFonts w:ascii="Cambria" w:eastAsia="Cambria" w:hAnsi="Cambria" w:cs="Cambria"/>
+                <w:bCs/>
+                <w:sz w:val="20"/>
+                <w:szCs w:val="20"/>
+              </w:rPr>
+            </w:pPr>
+            <w:r>
+              <w:t>{ws_</w:t>
+            </w:r>
+            <w:r>
+              <w:t>1</w:t>
+            </w:r>
+            <w:r>
+              <w:t>1}</w:t>
+            </w:r>
           </w:p>
         </w:tc>
         <w:tc>
@@ -1400,13 +1490,23 @@
           </w:p>
           <w:p>
             <w:pPr>
-              <w:rPr>
-                <w:rFonts w:ascii="Cambria" w:eastAsia="Cambria" w:hAnsi="Cambria" w:cs="Cambria"/>
-                <w:bCs/>
-                <w:sz w:val="20"/>
-                <w:szCs w:val="20"/>
-              </w:rPr>
-            </w:pPr>
+              <w:jc w:val="center"/>
+              <w:rPr>
+                <w:rFonts w:ascii="Cambria" w:eastAsia="Cambria" w:hAnsi="Cambria" w:cs="Cambria"/>
+                <w:bCs/>
+                <w:sz w:val="20"/>
+                <w:szCs w:val="20"/>
+              </w:rPr>
+            </w:pPr>
+            <w:r>
+              <w:t>{ws_1</w:t>
+            </w:r>
+            <w:r>
+              <w:t>2</w:t>
+            </w:r>
+            <w:r>
+              <w:t>}</w:t>
+            </w:r>
           </w:p>
         </w:tc>
         <w:tc>
@@ -1453,13 +1553,23 @@
           </w:p>
           <w:p>
             <w:pPr>
-              <w:rPr>
-                <w:rFonts w:ascii="Cambria" w:eastAsia="Cambria" w:hAnsi="Cambria" w:cs="Cambria"/>
-                <w:bCs/>
-                <w:sz w:val="20"/>
-                <w:szCs w:val="20"/>
-              </w:rPr>
-            </w:pPr>
+              <w:jc w:val="center"/>
+              <w:rPr>
+                <w:rFonts w:ascii="Cambria" w:eastAsia="Cambria" w:hAnsi="Cambria" w:cs="Cambria"/>
+                <w:bCs/>
+                <w:sz w:val="20"/>
+                <w:szCs w:val="20"/>
+              </w:rPr>
+            </w:pPr>
+            <w:r>
+              <w:t>{ws_1</w:t>
+            </w:r>
+            <w:r>
+              <w:t>3</w:t>
+            </w:r>
+            <w:r>
+              <w:t>}</w:t>
+            </w:r>
           </w:p>
         </w:tc>
         <w:tc>
@@ -1487,13 +1597,23 @@
           </w:p>
           <w:p>
             <w:pPr>
-              <w:rPr>
-                <w:rFonts w:ascii="Cambria" w:eastAsia="Cambria" w:hAnsi="Cambria" w:cs="Cambria"/>
-                <w:bCs/>
-                <w:sz w:val="20"/>
-                <w:szCs w:val="20"/>
-              </w:rPr>
-            </w:pPr>
+              <w:jc w:val="center"/>
+              <w:rPr>
+                <w:rFonts w:ascii="Cambria" w:eastAsia="Cambria" w:hAnsi="Cambria" w:cs="Cambria"/>
+                <w:bCs/>
+                <w:sz w:val="20"/>
+                <w:szCs w:val="20"/>
+              </w:rPr>
+            </w:pPr>
+            <w:r>
+              <w:t>{ws_1</w:t>
+            </w:r>
+            <w:r>
+              <w:t>4</w:t>
+            </w:r>
+            <w:r>
+              <w:t>}</w:t>
+            </w:r>
           </w:p>
         </w:tc>
         <w:tc>
@@ -1521,13 +1641,23 @@
           </w:p>
           <w:p>
             <w:pPr>
-              <w:rPr>
-                <w:rFonts w:ascii="Cambria" w:eastAsia="Cambria" w:hAnsi="Cambria" w:cs="Cambria"/>
-                <w:bCs/>
-                <w:sz w:val="20"/>
-                <w:szCs w:val="20"/>
-              </w:rPr>
-            </w:pPr>
+              <w:jc w:val="center"/>
+              <w:rPr>
+                <w:rFonts w:ascii="Cambria" w:eastAsia="Cambria" w:hAnsi="Cambria" w:cs="Cambria"/>
+                <w:bCs/>
+                <w:sz w:val="20"/>
+                <w:szCs w:val="20"/>
+              </w:rPr>
+            </w:pPr>
+            <w:r>
+              <w:t>{ws_1</w:t>
+            </w:r>
+            <w:r>
+              <w:t>5</w:t>
+            </w:r>
+            <w:r>
+              <w:t>}</w:t>
+            </w:r>
           </w:p>
         </w:tc>
         <w:tc>
@@ -1555,13 +1685,23 @@
           </w:p>
           <w:p>
             <w:pPr>
-              <w:rPr>
-                <w:rFonts w:ascii="Cambria" w:eastAsia="Cambria" w:hAnsi="Cambria" w:cs="Cambria"/>
-                <w:bCs/>
-                <w:sz w:val="20"/>
-                <w:szCs w:val="20"/>
-              </w:rPr>
-            </w:pPr>
+              <w:jc w:val="center"/>
+              <w:rPr>
+                <w:rFonts w:ascii="Cambria" w:eastAsia="Cambria" w:hAnsi="Cambria" w:cs="Cambria"/>
+                <w:bCs/>
+                <w:sz w:val="20"/>
+                <w:szCs w:val="20"/>
+              </w:rPr>
+            </w:pPr>
+            <w:r>
+              <w:t>{ws_1</w:t>
+            </w:r>
+            <w:r>
+              <w:t>6</w:t>
+            </w:r>
+            <w:r>
+              <w:t>}</w:t>
+            </w:r>
           </w:p>
         </w:tc>
       </w:tr>
@@ -1595,13 +1735,23 @@
           </w:p>
           <w:p>
             <w:pPr>
-              <w:rPr>
-                <w:rFonts w:ascii="Cambria" w:eastAsia="Cambria" w:hAnsi="Cambria" w:cs="Cambria"/>
-                <w:bCs/>
-                <w:sz w:val="20"/>
-                <w:szCs w:val="20"/>
-              </w:rPr>
-            </w:pPr>
+              <w:jc w:val="center"/>
+              <w:rPr>
+                <w:rFonts w:ascii="Cambria" w:eastAsia="Cambria" w:hAnsi="Cambria" w:cs="Cambria"/>
+                <w:bCs/>
+                <w:sz w:val="20"/>
+                <w:szCs w:val="20"/>
+              </w:rPr>
+            </w:pPr>
+            <w:r>
+              <w:t>{ws_1</w:t>
+            </w:r>
+            <w:r>
+              <w:t>7</w:t>
+            </w:r>
+            <w:r>
+              <w:t>}</w:t>
+            </w:r>
           </w:p>
         </w:tc>
         <w:tc>
@@ -1629,13 +1779,23 @@
           </w:p>
           <w:p>
             <w:pPr>
-              <w:rPr>
-                <w:rFonts w:ascii="Cambria" w:eastAsia="Cambria" w:hAnsi="Cambria" w:cs="Cambria"/>
-                <w:bCs/>
-                <w:sz w:val="20"/>
-                <w:szCs w:val="20"/>
-              </w:rPr>
-            </w:pPr>
+              <w:jc w:val="center"/>
+              <w:rPr>
+                <w:rFonts w:ascii="Cambria" w:eastAsia="Cambria" w:hAnsi="Cambria" w:cs="Cambria"/>
+                <w:bCs/>
+                <w:sz w:val="20"/>
+                <w:szCs w:val="20"/>
+              </w:rPr>
+            </w:pPr>
+            <w:r>
+              <w:t>{ws_1</w:t>
+            </w:r>
+            <w:r>
+              <w:t>8</w:t>
+            </w:r>
+            <w:r>
+              <w:t>}</w:t>
+            </w:r>
           </w:p>
         </w:tc>
         <w:tc>
@@ -1663,13 +1823,23 @@
           </w:p>
           <w:p>
             <w:pPr>
-              <w:rPr>
-                <w:rFonts w:ascii="Cambria" w:eastAsia="Cambria" w:hAnsi="Cambria" w:cs="Cambria"/>
-                <w:bCs/>
-                <w:sz w:val="20"/>
-                <w:szCs w:val="20"/>
-              </w:rPr>
-            </w:pPr>
+              <w:jc w:val="center"/>
+              <w:rPr>
+                <w:rFonts w:ascii="Cambria" w:eastAsia="Cambria" w:hAnsi="Cambria" w:cs="Cambria"/>
+                <w:bCs/>
+                <w:sz w:val="20"/>
+                <w:szCs w:val="20"/>
+              </w:rPr>
+            </w:pPr>
+            <w:r>
+              <w:t>{ws_1</w:t>
+            </w:r>
+            <w:r>
+              <w:t>9</w:t>
+            </w:r>
+            <w:r>
+              <w:t>}</w:t>
+            </w:r>
           </w:p>
           <w:p>
             <w:pPr>
@@ -1707,13 +1877,20 @@
           </w:p>
           <w:p>
             <w:pPr>
-              <w:rPr>
-                <w:rFonts w:ascii="Cambria" w:eastAsia="Cambria" w:hAnsi="Cambria" w:cs="Cambria"/>
-                <w:bCs/>
-                <w:sz w:val="20"/>
-                <w:szCs w:val="20"/>
-              </w:rPr>
-            </w:pPr>
+              <w:jc w:val="center"/>
+              <w:rPr>
+                <w:rFonts w:ascii="Cambria" w:eastAsia="Cambria" w:hAnsi="Cambria" w:cs="Cambria"/>
+                <w:bCs/>
+                <w:sz w:val="20"/>
+                <w:szCs w:val="20"/>
+              </w:rPr>
+            </w:pPr>
+            <w:r>
+              <w:t>{ws_20</w:t>
+            </w:r>
+            <w:r>
+              <w:t>}</w:t>
+            </w:r>
           </w:p>
           <w:p>
             <w:pPr>
@@ -1770,13 +1947,23 @@
           </w:p>
           <w:p>
             <w:pPr>
-              <w:rPr>
-                <w:rFonts w:ascii="Cambria" w:eastAsia="Cambria" w:hAnsi="Cambria" w:cs="Cambria"/>
-                <w:bCs/>
-                <w:sz w:val="20"/>
-                <w:szCs w:val="20"/>
-              </w:rPr>
-            </w:pPr>
+              <w:jc w:val="center"/>
+              <w:rPr>
+                <w:rFonts w:ascii="Cambria" w:eastAsia="Cambria" w:hAnsi="Cambria" w:cs="Cambria"/>
+                <w:bCs/>
+                <w:sz w:val="20"/>
+                <w:szCs w:val="20"/>
+              </w:rPr>
+            </w:pPr>
+            <w:r>
+              <w:t>{ws_</w:t>
+            </w:r>
+            <w:r>
+              <w:t>2</w:t>
+            </w:r>
+            <w:r>
+              <w:t>1}</w:t>
+            </w:r>
           </w:p>
           <w:p>
             <w:pPr>
@@ -1814,13 +2001,20 @@
           </w:p>
           <w:p>
             <w:pPr>
-              <w:rPr>
-                <w:rFonts w:ascii="Cambria" w:eastAsia="Cambria" w:hAnsi="Cambria" w:cs="Cambria"/>
-                <w:bCs/>
-                <w:sz w:val="20"/>
-                <w:szCs w:val="20"/>
-              </w:rPr>
-            </w:pPr>
+              <w:jc w:val="center"/>
+              <w:rPr>
+                <w:rFonts w:ascii="Cambria" w:eastAsia="Cambria" w:hAnsi="Cambria" w:cs="Cambria"/>
+                <w:bCs/>
+                <w:sz w:val="20"/>
+                <w:szCs w:val="20"/>
+              </w:rPr>
+            </w:pPr>
+            <w:r>
+              <w:t>{ws_22</w:t>
+            </w:r>
+            <w:r>
+              <w:t>}</w:t>
+            </w:r>
           </w:p>
           <w:p>
             <w:pPr>
@@ -1858,13 +2052,23 @@
           </w:p>
           <w:p>
             <w:pPr>
-              <w:rPr>
-                <w:rFonts w:ascii="Cambria" w:eastAsia="Cambria" w:hAnsi="Cambria" w:cs="Cambria"/>
-                <w:bCs/>
-                <w:sz w:val="20"/>
-                <w:szCs w:val="20"/>
-              </w:rPr>
-            </w:pPr>
+              <w:jc w:val="center"/>
+              <w:rPr>
+                <w:rFonts w:ascii="Cambria" w:eastAsia="Cambria" w:hAnsi="Cambria" w:cs="Cambria"/>
+                <w:bCs/>
+                <w:sz w:val="20"/>
+                <w:szCs w:val="20"/>
+              </w:rPr>
+            </w:pPr>
+            <w:r>
+              <w:t>{ws_</w:t>
+            </w:r>
+            <w:r>
+              <w:t>23</w:t>
+            </w:r>
+            <w:r>
+              <w:t>}</w:t>
+            </w:r>
           </w:p>
           <w:p>
             <w:pPr>
@@ -1902,13 +2106,23 @@
           </w:p>
           <w:p>
             <w:pPr>
-              <w:rPr>
-                <w:rFonts w:ascii="Cambria" w:eastAsia="Cambria" w:hAnsi="Cambria" w:cs="Cambria"/>
-                <w:bCs/>
-                <w:sz w:val="20"/>
-                <w:szCs w:val="20"/>
-              </w:rPr>
-            </w:pPr>
+              <w:jc w:val="center"/>
+              <w:rPr>
+                <w:rFonts w:ascii="Cambria" w:eastAsia="Cambria" w:hAnsi="Cambria" w:cs="Cambria"/>
+                <w:bCs/>
+                <w:sz w:val="20"/>
+                <w:szCs w:val="20"/>
+              </w:rPr>
+            </w:pPr>
+            <w:r>
+              <w:t>{ws_</w:t>
+            </w:r>
+            <w:r>
+              <w:t>24</w:t>
+            </w:r>
+            <w:r>
+              <w:t>}</w:t>
+            </w:r>
           </w:p>
           <w:p>
             <w:pPr>
@@ -1952,13 +2166,23 @@
           </w:p>
           <w:p>
             <w:pPr>
-              <w:rPr>
-                <w:rFonts w:ascii="Cambria" w:eastAsia="Cambria" w:hAnsi="Cambria" w:cs="Cambria"/>
-                <w:bCs/>
-                <w:sz w:val="20"/>
-                <w:szCs w:val="20"/>
-              </w:rPr>
-            </w:pPr>
+              <w:jc w:val="center"/>
+              <w:rPr>
+                <w:rFonts w:ascii="Cambria" w:eastAsia="Cambria" w:hAnsi="Cambria" w:cs="Cambria"/>
+                <w:bCs/>
+                <w:sz w:val="20"/>
+                <w:szCs w:val="20"/>
+              </w:rPr>
+            </w:pPr>
+            <w:r>
+              <w:t>{ws_</w:t>
+            </w:r>
+            <w:r>
+              <w:t>25</w:t>
+            </w:r>
+            <w:r>
+              <w:t>}</w:t>
+            </w:r>
           </w:p>
           <w:p>
             <w:pPr>
@@ -1996,13 +2220,23 @@
           </w:p>
           <w:p>
             <w:pPr>
-              <w:rPr>
-                <w:rFonts w:ascii="Cambria" w:eastAsia="Cambria" w:hAnsi="Cambria" w:cs="Cambria"/>
-                <w:bCs/>
-                <w:sz w:val="20"/>
-                <w:szCs w:val="20"/>
-              </w:rPr>
-            </w:pPr>
+              <w:jc w:val="center"/>
+              <w:rPr>
+                <w:rFonts w:ascii="Cambria" w:eastAsia="Cambria" w:hAnsi="Cambria" w:cs="Cambria"/>
+                <w:bCs/>
+                <w:sz w:val="20"/>
+                <w:szCs w:val="20"/>
+              </w:rPr>
+            </w:pPr>
+            <w:r>
+              <w:t>{ws_</w:t>
+            </w:r>
+            <w:r>
+              <w:t>26</w:t>
+            </w:r>
+            <w:r>
+              <w:t>}</w:t>
+            </w:r>
           </w:p>
         </w:tc>
         <w:tc>
@@ -2030,13 +2264,23 @@
           </w:p>
           <w:p>
             <w:pPr>
-              <w:rPr>
-                <w:rFonts w:ascii="Cambria" w:eastAsia="Cambria" w:hAnsi="Cambria" w:cs="Cambria"/>
-                <w:bCs/>
-                <w:sz w:val="20"/>
-                <w:szCs w:val="20"/>
-              </w:rPr>
-            </w:pPr>
+              <w:jc w:val="center"/>
+              <w:rPr>
+                <w:rFonts w:ascii="Cambria" w:eastAsia="Cambria" w:hAnsi="Cambria" w:cs="Cambria"/>
+                <w:bCs/>
+                <w:sz w:val="20"/>
+                <w:szCs w:val="20"/>
+              </w:rPr>
+            </w:pPr>
+            <w:r>
+              <w:t>{ws_</w:t>
+            </w:r>
+            <w:r>
+              <w:t>27</w:t>
+            </w:r>
+            <w:r>
+              <w:t>}</w:t>
+            </w:r>
           </w:p>
         </w:tc>
         <w:tc>
@@ -2064,13 +2308,23 @@
           </w:p>
           <w:p>
             <w:pPr>
-              <w:rPr>
-                <w:rFonts w:ascii="Cambria" w:eastAsia="Cambria" w:hAnsi="Cambria" w:cs="Cambria"/>
-                <w:bCs/>
-                <w:sz w:val="20"/>
-                <w:szCs w:val="20"/>
-              </w:rPr>
-            </w:pPr>
+              <w:jc w:val="center"/>
+              <w:rPr>
+                <w:rFonts w:ascii="Cambria" w:eastAsia="Cambria" w:hAnsi="Cambria" w:cs="Cambria"/>
+                <w:bCs/>
+                <w:sz w:val="20"/>
+                <w:szCs w:val="20"/>
+              </w:rPr>
+            </w:pPr>
+            <w:r>
+              <w:t>{ws_</w:t>
+            </w:r>
+            <w:r>
+              <w:t>28</w:t>
+            </w:r>
+            <w:r>
+              <w:t>}</w:t>
+            </w:r>
           </w:p>
         </w:tc>
         <w:tc>
@@ -2117,13 +2371,23 @@
           </w:p>
           <w:p>
             <w:pPr>
-              <w:rPr>
-                <w:rFonts w:ascii="Cambria" w:eastAsia="Cambria" w:hAnsi="Cambria" w:cs="Cambria"/>
-                <w:bCs/>
-                <w:sz w:val="20"/>
-                <w:szCs w:val="20"/>
-              </w:rPr>
-            </w:pPr>
+              <w:jc w:val="center"/>
+              <w:rPr>
+                <w:rFonts w:ascii="Cambria" w:eastAsia="Cambria" w:hAnsi="Cambria" w:cs="Cambria"/>
+                <w:bCs/>
+                <w:sz w:val="20"/>
+                <w:szCs w:val="20"/>
+              </w:rPr>
+            </w:pPr>
+            <w:r>
+              <w:t>{ws_</w:t>
+            </w:r>
+            <w:r>
+              <w:t>29</w:t>
+            </w:r>
+            <w:r>
+              <w:t>}</w:t>
+            </w:r>
           </w:p>
         </w:tc>
         <w:tc>
@@ -2151,13 +2415,23 @@
           </w:p>
           <w:p>
             <w:pPr>
-              <w:rPr>
-                <w:rFonts w:ascii="Cambria" w:eastAsia="Cambria" w:hAnsi="Cambria" w:cs="Cambria"/>
-                <w:bCs/>
-                <w:sz w:val="20"/>
-                <w:szCs w:val="20"/>
-              </w:rPr>
-            </w:pPr>
+              <w:jc w:val="center"/>
+              <w:rPr>
+                <w:rFonts w:ascii="Cambria" w:eastAsia="Cambria" w:hAnsi="Cambria" w:cs="Cambria"/>
+                <w:bCs/>
+                <w:sz w:val="20"/>
+                <w:szCs w:val="20"/>
+              </w:rPr>
+            </w:pPr>
+            <w:r>
+              <w:t>{ws_</w:t>
+            </w:r>
+            <w:r>
+              <w:t>30</w:t>
+            </w:r>
+            <w:r>
+              <w:t>}</w:t>
+            </w:r>
           </w:p>
         </w:tc>
         <w:tc>
@@ -2185,13 +2459,23 @@
           </w:p>
           <w:p>
             <w:pPr>
-              <w:rPr>
-                <w:rFonts w:ascii="Cambria" w:eastAsia="Cambria" w:hAnsi="Cambria" w:cs="Cambria"/>
-                <w:bCs/>
-                <w:sz w:val="20"/>
-                <w:szCs w:val="20"/>
-              </w:rPr>
-            </w:pPr>
+              <w:jc w:val="center"/>
+              <w:rPr>
+                <w:rFonts w:ascii="Cambria" w:eastAsia="Cambria" w:hAnsi="Cambria" w:cs="Cambria"/>
+                <w:bCs/>
+                <w:sz w:val="20"/>
+                <w:szCs w:val="20"/>
+              </w:rPr>
+            </w:pPr>
+            <w:r>
+              <w:t>{ws_</w:t>
+            </w:r>
+            <w:r>
+              <w:t>3</w:t>
+            </w:r>
+            <w:r>
+              <w:t>1}</w:t>
+            </w:r>
           </w:p>
         </w:tc>
         <w:tc>
@@ -2219,15 +2503,24 @@
           </w:p>
           <w:p>
             <w:pPr>
-              <w:rPr>
-                <w:rFonts w:ascii="Cambria" w:eastAsia="Cambria" w:hAnsi="Cambria" w:cs="Cambria"/>
-                <w:bCs/>
-                <w:sz w:val="20"/>
-                <w:szCs w:val="20"/>
-              </w:rPr>
-            </w:pPr>
-          </w:p>
-        </w:tc>
+              <w:jc w:val="center"/>
+              <w:rPr>
+                <w:rFonts w:ascii="Cambria" w:eastAsia="Cambria" w:hAnsi="Cambria" w:cs="Cambria"/>
+                <w:bCs/>
+                <w:sz w:val="20"/>
+                <w:szCs w:val="20"/>
+              </w:rPr>
+            </w:pPr>
+            <w:r>
+              <w:t>{ws_32</w:t>
+            </w:r>
+            <w:r>
+              <w:t>}</w:t>
+            </w:r>
+          </w:p>
+        </w:tc>
+        <w:bookmarkStart w:id="0" w:name="_GoBack"/>
+        <w:bookmarkEnd w:id="0"/>
       </w:tr>
       <w:tr>
         <w:trPr>
@@ -2267,6 +2560,12 @@
                 <w:szCs w:val="20"/>
               </w:rPr>
             </w:pPr>
+            <w:r>
+              <w:t>{ws_33</w:t>
+            </w:r>
+            <w:r>
+              <w:t>}</w:t>
+            </w:r>
           </w:p>
         </w:tc>
         <w:tc>
@@ -2302,6 +2601,12 @@
                 <w:szCs w:val="20"/>
               </w:rPr>
             </w:pPr>
+            <w:r>
+              <w:t>{ws_34</w:t>
+            </w:r>
+            <w:r>
+              <w:t>}</w:t>
+            </w:r>
           </w:p>
         </w:tc>
         <w:tc>
@@ -2337,6 +2642,12 @@
                 <w:szCs w:val="20"/>
               </w:rPr>
             </w:pPr>
+            <w:r>
+              <w:t>{ws_35</w:t>
+            </w:r>
+            <w:r>
+              <w:t>}</w:t>
+            </w:r>
           </w:p>
         </w:tc>
         <w:tc>
@@ -2364,13 +2675,20 @@
           </w:p>
           <w:p>
             <w:pPr>
-              <w:rPr>
-                <w:rFonts w:ascii="Cambria" w:eastAsia="Cambria" w:hAnsi="Cambria" w:cs="Cambria"/>
-                <w:bCs/>
-                <w:sz w:val="20"/>
-                <w:szCs w:val="20"/>
-              </w:rPr>
-            </w:pPr>
+              <w:jc w:val="center"/>
+              <w:rPr>
+                <w:rFonts w:ascii="Cambria" w:eastAsia="Cambria" w:hAnsi="Cambria" w:cs="Cambria"/>
+                <w:bCs/>
+                <w:sz w:val="20"/>
+                <w:szCs w:val="20"/>
+              </w:rPr>
+            </w:pPr>
+            <w:r>
+              <w:t>{ws_36</w:t>
+            </w:r>
+            <w:r>
+              <w:t>}</w:t>
+            </w:r>
           </w:p>
         </w:tc>
         <w:tc>
@@ -2417,13 +2735,20 @@
           </w:p>
           <w:p>
             <w:pPr>
-              <w:rPr>
-                <w:rFonts w:ascii="Cambria" w:eastAsia="Cambria" w:hAnsi="Cambria" w:cs="Cambria"/>
-                <w:bCs/>
-                <w:sz w:val="20"/>
-                <w:szCs w:val="20"/>
-              </w:rPr>
-            </w:pPr>
+              <w:jc w:val="center"/>
+              <w:rPr>
+                <w:rFonts w:ascii="Cambria" w:eastAsia="Cambria" w:hAnsi="Cambria" w:cs="Cambria"/>
+                <w:bCs/>
+                <w:sz w:val="20"/>
+                <w:szCs w:val="20"/>
+              </w:rPr>
+            </w:pPr>
+            <w:r>
+              <w:t>{ws_37</w:t>
+            </w:r>
+            <w:r>
+              <w:t>}</w:t>
+            </w:r>
           </w:p>
         </w:tc>
         <w:tc>
@@ -2451,13 +2776,20 @@
           </w:p>
           <w:p>
             <w:pPr>
-              <w:rPr>
-                <w:rFonts w:ascii="Cambria" w:eastAsia="Cambria" w:hAnsi="Cambria" w:cs="Cambria"/>
-                <w:bCs/>
-                <w:sz w:val="20"/>
-                <w:szCs w:val="20"/>
-              </w:rPr>
-            </w:pPr>
+              <w:jc w:val="center"/>
+              <w:rPr>
+                <w:rFonts w:ascii="Cambria" w:eastAsia="Cambria" w:hAnsi="Cambria" w:cs="Cambria"/>
+                <w:bCs/>
+                <w:sz w:val="20"/>
+                <w:szCs w:val="20"/>
+              </w:rPr>
+            </w:pPr>
+            <w:r>
+              <w:t>{ws_38</w:t>
+            </w:r>
+            <w:r>
+              <w:t>}</w:t>
+            </w:r>
           </w:p>
         </w:tc>
         <w:tc>
@@ -2485,13 +2817,20 @@
           </w:p>
           <w:p>
             <w:pPr>
-              <w:rPr>
-                <w:rFonts w:ascii="Cambria" w:eastAsia="Cambria" w:hAnsi="Cambria" w:cs="Cambria"/>
-                <w:bCs/>
-                <w:sz w:val="20"/>
-                <w:szCs w:val="20"/>
-              </w:rPr>
-            </w:pPr>
+              <w:jc w:val="center"/>
+              <w:rPr>
+                <w:rFonts w:ascii="Cambria" w:eastAsia="Cambria" w:hAnsi="Cambria" w:cs="Cambria"/>
+                <w:bCs/>
+                <w:sz w:val="20"/>
+                <w:szCs w:val="20"/>
+              </w:rPr>
+            </w:pPr>
+            <w:r>
+              <w:t>{ws_39</w:t>
+            </w:r>
+            <w:r>
+              <w:t>}</w:t>
+            </w:r>
           </w:p>
         </w:tc>
         <w:tc>
@@ -2519,13 +2858,20 @@
           </w:p>
           <w:p>
             <w:pPr>
-              <w:rPr>
-                <w:rFonts w:ascii="Cambria" w:eastAsia="Cambria" w:hAnsi="Cambria" w:cs="Cambria"/>
-                <w:bCs/>
-                <w:sz w:val="20"/>
-                <w:szCs w:val="20"/>
-              </w:rPr>
-            </w:pPr>
+              <w:jc w:val="center"/>
+              <w:rPr>
+                <w:rFonts w:ascii="Cambria" w:eastAsia="Cambria" w:hAnsi="Cambria" w:cs="Cambria"/>
+                <w:bCs/>
+                <w:sz w:val="20"/>
+                <w:szCs w:val="20"/>
+              </w:rPr>
+            </w:pPr>
+            <w:r>
+              <w:t>{ws_40</w:t>
+            </w:r>
+            <w:r>
+              <w:t>}</w:t>
+            </w:r>
           </w:p>
         </w:tc>
       </w:tr>
@@ -2576,8 +2922,6 @@
         </w:rPr>
         <w:t>}</w:t>
       </w:r>
-      <w:bookmarkStart w:id="0" w:name="_GoBack"/>
-      <w:bookmarkEnd w:id="0"/>
     </w:p>
     <w:p>
       <w:pPr>
@@ -2870,6 +3214,7 @@
               <w:rPr>
                 <w:rFonts w:ascii="Cambria" w:eastAsia="Cambria" w:hAnsi="Cambria" w:cs="Cambria"/>
               </w:rPr>
+              <w:lastRenderedPageBreak/>
               <w:t>Laboratory Custodian</w:t>
             </w:r>
           </w:p>
@@ -3590,7 +3935,6 @@
       <w:rPr>
         <w:noProof/>
         <w:color w:val="000000"/>
-        <w:lang w:val="en-PH" w:eastAsia="en-PH"/>
       </w:rPr>
       <w:drawing>
         <wp:inline distT="0" distB="0" distL="0" distR="0" wp14:anchorId="2BA53806" wp14:editId="7C62F8B2">

</xml_diff>